<commit_message>
Reshape to a tourism data analyst website
</commit_message>
<xml_diff>
--- a/documents/Resume.docx
+++ b/documents/Resume.docx
@@ -278,25 +278,7 @@
             <w:sz w:val="28"/>
             <w:szCs w:val="28"/>
           </w:rPr>
-          <w:t>Portfo</w:t>
-        </w:r>
-        <w:r>
-          <w:rPr>
-            <w:rStyle w:val="Hyperlink"/>
-            <w:rFonts w:asciiTheme="majorHAnsi" w:hAnsiTheme="majorHAnsi" w:cstheme="majorHAnsi"/>
-            <w:sz w:val="28"/>
-            <w:szCs w:val="28"/>
-          </w:rPr>
-          <w:t>l</w:t>
-        </w:r>
-        <w:r>
-          <w:rPr>
-            <w:rStyle w:val="Hyperlink"/>
-            <w:rFonts w:asciiTheme="majorHAnsi" w:hAnsiTheme="majorHAnsi" w:cstheme="majorHAnsi"/>
-            <w:sz w:val="28"/>
-            <w:szCs w:val="28"/>
-          </w:rPr>
-          <w:t>io</w:t>
+          <w:t>Portfolio</w:t>
         </w:r>
       </w:hyperlink>
       <w:r>
@@ -334,25 +316,7 @@
             <w:sz w:val="28"/>
             <w:szCs w:val="28"/>
           </w:rPr>
-          <w:t>We</w:t>
-        </w:r>
-        <w:r>
-          <w:rPr>
-            <w:rStyle w:val="Hyperlink"/>
-            <w:rFonts w:asciiTheme="majorHAnsi" w:hAnsiTheme="majorHAnsi" w:cstheme="majorHAnsi"/>
-            <w:sz w:val="28"/>
-            <w:szCs w:val="28"/>
-          </w:rPr>
-          <w:t>b</w:t>
-        </w:r>
-        <w:r>
-          <w:rPr>
-            <w:rStyle w:val="Hyperlink"/>
-            <w:rFonts w:asciiTheme="majorHAnsi" w:hAnsiTheme="majorHAnsi" w:cstheme="majorHAnsi"/>
-            <w:sz w:val="28"/>
-            <w:szCs w:val="28"/>
-          </w:rPr>
-          <w:t>site</w:t>
+          <w:t>Website</w:t>
         </w:r>
       </w:hyperlink>
     </w:p>
@@ -412,185 +376,23 @@
           <w:sz w:val="22"/>
           <w:szCs w:val="22"/>
         </w:rPr>
-        <w:t>Data scientist with 3 y</w:t>
-      </w:r>
-      <w:r>
-        <w:rPr>
-          <w:rFonts w:asciiTheme="majorHAnsi" w:hAnsiTheme="majorHAnsi" w:cstheme="majorHAnsi"/>
-          <w:sz w:val="22"/>
-          <w:szCs w:val="22"/>
-        </w:rPr>
-        <w:t>ea</w:t>
-      </w:r>
-      <w:r>
-        <w:rPr>
-          <w:rFonts w:asciiTheme="majorHAnsi" w:hAnsiTheme="majorHAnsi" w:cstheme="majorHAnsi"/>
-          <w:sz w:val="22"/>
-          <w:szCs w:val="22"/>
-        </w:rPr>
-        <w:t>rs</w:t>
-      </w:r>
-      <w:r>
-        <w:rPr>
-          <w:rFonts w:asciiTheme="majorHAnsi" w:hAnsiTheme="majorHAnsi" w:cstheme="majorHAnsi"/>
-          <w:sz w:val="22"/>
-          <w:szCs w:val="22"/>
-        </w:rPr>
-        <w:t xml:space="preserve"> of</w:t>
-      </w:r>
-      <w:r>
-        <w:rPr>
-          <w:rFonts w:asciiTheme="majorHAnsi" w:hAnsiTheme="majorHAnsi" w:cstheme="majorHAnsi"/>
-          <w:sz w:val="22"/>
-          <w:szCs w:val="22"/>
-        </w:rPr>
-        <w:t xml:space="preserve"> experience translating ML insights into </w:t>
-      </w:r>
-      <w:r>
-        <w:rPr>
-          <w:rFonts w:asciiTheme="majorHAnsi" w:hAnsiTheme="majorHAnsi" w:cstheme="majorHAnsi"/>
-          <w:sz w:val="22"/>
-          <w:szCs w:val="22"/>
-        </w:rPr>
-        <w:t xml:space="preserve">over </w:t>
-      </w:r>
-      <w:r>
-        <w:rPr>
-          <w:rFonts w:asciiTheme="majorHAnsi" w:hAnsiTheme="majorHAnsi" w:cstheme="majorHAnsi"/>
-          <w:sz w:val="22"/>
-          <w:szCs w:val="22"/>
-        </w:rPr>
-        <w:t>500% KPI gains for tourism, retail and industrial clients. Expert in Python (</w:t>
-      </w:r>
-      <w:proofErr w:type="spellStart"/>
-      <w:r>
-        <w:rPr>
-          <w:rFonts w:asciiTheme="majorHAnsi" w:hAnsiTheme="majorHAnsi" w:cstheme="majorHAnsi"/>
-          <w:sz w:val="22"/>
-          <w:szCs w:val="22"/>
-        </w:rPr>
-        <w:t>PyTorch</w:t>
-      </w:r>
-      <w:proofErr w:type="spellEnd"/>
-      <w:r>
-        <w:rPr>
-          <w:rFonts w:asciiTheme="majorHAnsi" w:hAnsiTheme="majorHAnsi" w:cstheme="majorHAnsi"/>
-          <w:sz w:val="22"/>
-          <w:szCs w:val="22"/>
-        </w:rPr>
-        <w:t>, scikit</w:t>
-      </w:r>
-      <w:r>
-        <w:rPr>
-          <w:rFonts w:ascii="Cambria Math" w:hAnsi="Cambria Math" w:cs="Cambria Math"/>
-          <w:sz w:val="22"/>
-          <w:szCs w:val="22"/>
-        </w:rPr>
-        <w:t>‑</w:t>
-      </w:r>
-      <w:r>
-        <w:rPr>
-          <w:rFonts w:asciiTheme="majorHAnsi" w:hAnsiTheme="majorHAnsi" w:cstheme="majorHAnsi"/>
-          <w:sz w:val="22"/>
-          <w:szCs w:val="22"/>
-        </w:rPr>
-        <w:t>learn), SQL</w:t>
-      </w:r>
-      <w:r>
-        <w:rPr>
-          <w:rFonts w:asciiTheme="majorHAnsi" w:hAnsiTheme="majorHAnsi" w:cstheme="majorHAnsi"/>
-          <w:sz w:val="22"/>
-          <w:szCs w:val="22"/>
-        </w:rPr>
-        <w:t>,</w:t>
-      </w:r>
-      <w:r>
-        <w:rPr>
-          <w:rFonts w:asciiTheme="majorHAnsi" w:hAnsiTheme="majorHAnsi" w:cstheme="majorHAnsi"/>
-          <w:sz w:val="22"/>
-          <w:szCs w:val="22"/>
-        </w:rPr>
-        <w:t xml:space="preserve"> and Gen</w:t>
-      </w:r>
-      <w:r>
-        <w:rPr>
-          <w:rFonts w:ascii="Cambria Math" w:hAnsi="Cambria Math" w:cs="Cambria Math"/>
-          <w:sz w:val="22"/>
-          <w:szCs w:val="22"/>
-        </w:rPr>
-        <w:t>‑</w:t>
-      </w:r>
-      <w:r>
-        <w:rPr>
-          <w:rFonts w:asciiTheme="majorHAnsi" w:hAnsiTheme="majorHAnsi" w:cstheme="majorHAnsi"/>
-          <w:sz w:val="22"/>
-          <w:szCs w:val="22"/>
-        </w:rPr>
-        <w:t>AI (LLMs, RAG). Known for automating data pipelines that save 200+ h</w:t>
-      </w:r>
-      <w:r>
-        <w:rPr>
-          <w:rFonts w:asciiTheme="majorHAnsi" w:hAnsiTheme="majorHAnsi" w:cstheme="majorHAnsi"/>
-          <w:sz w:val="22"/>
-          <w:szCs w:val="22"/>
-        </w:rPr>
-        <w:t>ou</w:t>
-      </w:r>
-      <w:r>
-        <w:rPr>
-          <w:rFonts w:asciiTheme="majorHAnsi" w:hAnsiTheme="majorHAnsi" w:cstheme="majorHAnsi"/>
-          <w:sz w:val="22"/>
-          <w:szCs w:val="22"/>
-        </w:rPr>
-        <w:t>rs</w:t>
-      </w:r>
-      <w:r>
-        <w:rPr>
-          <w:rFonts w:asciiTheme="majorHAnsi" w:hAnsiTheme="majorHAnsi" w:cstheme="majorHAnsi"/>
-          <w:sz w:val="22"/>
-          <w:szCs w:val="22"/>
-        </w:rPr>
-        <w:t xml:space="preserve"> per </w:t>
-      </w:r>
-      <w:r>
-        <w:rPr>
-          <w:rFonts w:asciiTheme="majorHAnsi" w:hAnsiTheme="majorHAnsi" w:cstheme="majorHAnsi"/>
-          <w:sz w:val="22"/>
-          <w:szCs w:val="22"/>
-        </w:rPr>
-        <w:t>y</w:t>
-      </w:r>
-      <w:r>
-        <w:rPr>
-          <w:rFonts w:asciiTheme="majorHAnsi" w:hAnsiTheme="majorHAnsi" w:cstheme="majorHAnsi"/>
-          <w:sz w:val="22"/>
-          <w:szCs w:val="22"/>
-        </w:rPr>
-        <w:t>ea</w:t>
-      </w:r>
-      <w:r>
-        <w:rPr>
-          <w:rFonts w:asciiTheme="majorHAnsi" w:hAnsiTheme="majorHAnsi" w:cstheme="majorHAnsi"/>
-          <w:sz w:val="22"/>
-          <w:szCs w:val="22"/>
-        </w:rPr>
-        <w:t>r and presenting findings to C</w:t>
-      </w:r>
-      <w:r>
-        <w:rPr>
-          <w:rFonts w:ascii="Cambria Math" w:hAnsi="Cambria Math" w:cs="Cambria Math"/>
-          <w:sz w:val="22"/>
-          <w:szCs w:val="22"/>
-        </w:rPr>
-        <w:t>‑</w:t>
-      </w:r>
-      <w:r>
-        <w:rPr>
-          <w:rFonts w:asciiTheme="majorHAnsi" w:hAnsiTheme="majorHAnsi" w:cstheme="majorHAnsi"/>
-          <w:sz w:val="22"/>
-          <w:szCs w:val="22"/>
-        </w:rPr>
-        <w:t>level audiences.</w:t>
+        <w:t>Data analyst specializing in tourism and destination marketing analytics, with experience translating complex datasets</w:t>
+      </w:r>
+      <w:r>
+        <w:rPr>
+          <w:rFonts w:asciiTheme="majorHAnsi" w:hAnsiTheme="majorHAnsi" w:cstheme="majorHAnsi"/>
+          <w:sz w:val="22"/>
+          <w:szCs w:val="22"/>
+        </w:rPr>
+        <w:t xml:space="preserve"> </w:t>
+      </w:r>
+      <w:r>
+        <w:rPr>
+          <w:rFonts w:asciiTheme="majorHAnsi" w:hAnsiTheme="majorHAnsi" w:cstheme="majorHAnsi"/>
+          <w:sz w:val="22"/>
+          <w:szCs w:val="22"/>
+        </w:rPr>
+        <w:t>into actionable insights for stakeholders, marketing strategy, demand forecasting, visitor insights, economic impact, stakeholder reporting, and campaign performance.</w:t>
       </w:r>
     </w:p>
     <w:p>
@@ -602,7 +404,6 @@
         <w:spacing w:line="252" w:lineRule="auto"/>
         <w:rPr>
           <w:rFonts w:asciiTheme="majorHAnsi" w:hAnsiTheme="majorHAnsi" w:cstheme="majorHAnsi"/>
-          <w:color w:val="auto"/>
           <w:sz w:val="22"/>
           <w:szCs w:val="22"/>
         </w:rPr>
@@ -691,90 +492,36 @@
           <w:sz w:val="22"/>
           <w:szCs w:val="22"/>
         </w:rPr>
-        <w:t xml:space="preserve">Generative AI (Gen AI) </w:t>
-      </w:r>
-      <w:r>
-        <w:rPr>
-          <w:rFonts w:asciiTheme="majorHAnsi" w:hAnsiTheme="majorHAnsi" w:cstheme="majorHAnsi"/>
-          <w:color w:val="auto"/>
-          <w:sz w:val="22"/>
-          <w:szCs w:val="22"/>
-        </w:rPr>
-        <w:t>- Large Language Models (LLMs)</w:t>
-      </w:r>
-      <w:r>
-        <w:rPr>
-          <w:rFonts w:asciiTheme="majorHAnsi" w:hAnsiTheme="majorHAnsi" w:cstheme="majorHAnsi"/>
-          <w:color w:val="auto"/>
-          <w:sz w:val="22"/>
-          <w:szCs w:val="22"/>
-        </w:rPr>
-        <w:t xml:space="preserve">, </w:t>
-      </w:r>
-      <w:r>
-        <w:rPr>
-          <w:rFonts w:asciiTheme="majorHAnsi" w:hAnsiTheme="majorHAnsi" w:cstheme="majorHAnsi"/>
-          <w:color w:val="auto"/>
-          <w:sz w:val="22"/>
-          <w:szCs w:val="22"/>
-        </w:rPr>
-        <w:t xml:space="preserve">Retrieval-Augmented Generation (RAG), </w:t>
-      </w:r>
-      <w:r>
-        <w:rPr>
-          <w:rFonts w:asciiTheme="majorHAnsi" w:hAnsiTheme="majorHAnsi" w:cstheme="majorHAnsi"/>
-          <w:color w:val="auto"/>
-          <w:sz w:val="22"/>
-          <w:szCs w:val="22"/>
-        </w:rPr>
-        <w:t>Low-Rank Adaptation (</w:t>
-      </w:r>
-      <w:proofErr w:type="spellStart"/>
-      <w:r>
-        <w:rPr>
-          <w:rFonts w:asciiTheme="majorHAnsi" w:hAnsiTheme="majorHAnsi" w:cstheme="majorHAnsi"/>
-          <w:color w:val="auto"/>
-          <w:sz w:val="22"/>
-          <w:szCs w:val="22"/>
-        </w:rPr>
-        <w:t>LoRA</w:t>
-      </w:r>
-      <w:proofErr w:type="spellEnd"/>
-      <w:r>
-        <w:rPr>
-          <w:rFonts w:asciiTheme="majorHAnsi" w:hAnsiTheme="majorHAnsi" w:cstheme="majorHAnsi"/>
-          <w:color w:val="auto"/>
-          <w:sz w:val="22"/>
-          <w:szCs w:val="22"/>
-        </w:rPr>
-        <w:t>)</w:t>
-      </w:r>
-      <w:r>
-        <w:rPr>
-          <w:rFonts w:asciiTheme="majorHAnsi" w:hAnsiTheme="majorHAnsi" w:cstheme="majorHAnsi"/>
-          <w:color w:val="auto"/>
-          <w:sz w:val="22"/>
-          <w:szCs w:val="22"/>
-        </w:rPr>
-        <w:t xml:space="preserve"> fine-tuning, </w:t>
-      </w:r>
-      <w:r>
-        <w:rPr>
-          <w:rFonts w:asciiTheme="majorHAnsi" w:hAnsiTheme="majorHAnsi" w:cstheme="majorHAnsi"/>
-          <w:color w:val="auto"/>
-          <w:sz w:val="22"/>
-          <w:szCs w:val="22"/>
-        </w:rPr>
-        <w:t>E</w:t>
-      </w:r>
-      <w:r>
-        <w:rPr>
-          <w:rFonts w:asciiTheme="majorHAnsi" w:hAnsiTheme="majorHAnsi" w:cstheme="majorHAnsi"/>
-          <w:color w:val="auto"/>
-          <w:sz w:val="22"/>
-          <w:szCs w:val="22"/>
-        </w:rPr>
-        <w:t>mbeddings, Transformers</w:t>
+        <w:t>Reporting &amp; BI</w:t>
+      </w:r>
+      <w:r>
+        <w:rPr>
+          <w:rFonts w:asciiTheme="majorHAnsi" w:hAnsiTheme="majorHAnsi" w:cstheme="majorHAnsi"/>
+          <w:b/>
+          <w:bCs/>
+          <w:color w:val="auto"/>
+          <w:sz w:val="22"/>
+          <w:szCs w:val="22"/>
+        </w:rPr>
+        <w:t xml:space="preserve"> </w:t>
+      </w:r>
+      <w:r>
+        <w:rPr>
+          <w:rFonts w:asciiTheme="majorHAnsi" w:hAnsiTheme="majorHAnsi" w:cstheme="majorHAnsi"/>
+          <w:color w:val="auto"/>
+          <w:sz w:val="22"/>
+          <w:szCs w:val="22"/>
+        </w:rPr>
+        <w:t xml:space="preserve">- </w:t>
+      </w:r>
+      <w:r>
+        <w:rPr>
+          <w:rFonts w:asciiTheme="majorHAnsi" w:hAnsiTheme="majorHAnsi" w:cstheme="majorHAnsi"/>
+          <w:color w:val="auto"/>
+          <w:sz w:val="22"/>
+          <w:szCs w:val="22"/>
+        </w:rPr>
+        <w:t>Tableau, Dashboards, KPI Development, Stakeholder Reporting, Campaign Performance, Marketing Analytics</w:t>
       </w:r>
     </w:p>
     <w:p>
@@ -819,34 +566,54 @@
           <w:sz w:val="22"/>
           <w:szCs w:val="22"/>
         </w:rPr>
-        <w:t>Deep-Learning</w:t>
-      </w:r>
-      <w:r>
-        <w:rPr>
-          <w:rFonts w:asciiTheme="majorHAnsi" w:hAnsiTheme="majorHAnsi" w:cstheme="majorHAnsi"/>
-          <w:color w:val="auto"/>
-          <w:sz w:val="22"/>
-          <w:szCs w:val="22"/>
-        </w:rPr>
-        <w:t xml:space="preserve"> - </w:t>
-      </w:r>
-      <w:r>
-        <w:rPr>
-          <w:rFonts w:asciiTheme="majorHAnsi" w:hAnsiTheme="majorHAnsi" w:cstheme="majorHAnsi"/>
-          <w:color w:val="auto"/>
-          <w:sz w:val="22"/>
-          <w:szCs w:val="22"/>
-        </w:rPr>
-        <w:t>Autoencoders, Variational Autoencoders (VAEs), Convolution Neural Networks (CNNs), Recurrent Neural Networks (RNNs), Reinforcement Learning (RL</w:t>
-      </w:r>
-      <w:r>
-        <w:rPr>
-          <w:rFonts w:asciiTheme="majorHAnsi" w:hAnsiTheme="majorHAnsi" w:cstheme="majorHAnsi"/>
-          <w:color w:val="auto"/>
-          <w:sz w:val="22"/>
-          <w:szCs w:val="22"/>
-        </w:rPr>
-        <w:t>)</w:t>
+        <w:t>Data &amp; Analytics</w:t>
+      </w:r>
+      <w:r>
+        <w:rPr>
+          <w:rFonts w:asciiTheme="majorHAnsi" w:hAnsiTheme="majorHAnsi" w:cstheme="majorHAnsi"/>
+          <w:b/>
+          <w:bCs/>
+          <w:color w:val="auto"/>
+          <w:sz w:val="22"/>
+          <w:szCs w:val="22"/>
+        </w:rPr>
+        <w:t xml:space="preserve"> </w:t>
+      </w:r>
+      <w:r>
+        <w:rPr>
+          <w:rFonts w:asciiTheme="majorHAnsi" w:hAnsiTheme="majorHAnsi" w:cstheme="majorHAnsi"/>
+          <w:color w:val="auto"/>
+          <w:sz w:val="22"/>
+          <w:szCs w:val="22"/>
+        </w:rPr>
+        <w:t xml:space="preserve">- </w:t>
+      </w:r>
+      <w:r>
+        <w:rPr>
+          <w:rFonts w:asciiTheme="majorHAnsi" w:hAnsiTheme="majorHAnsi" w:cstheme="majorHAnsi"/>
+          <w:color w:val="auto"/>
+          <w:sz w:val="22"/>
+          <w:szCs w:val="22"/>
+        </w:rPr>
+        <w:t>SQL, Excel, Python, Pandas, Demand Forecasting, Visitor Insights, Destination Marketing, Economi</w:t>
+      </w:r>
+      <w:r>
+        <w:rPr>
+          <w:rFonts w:asciiTheme="majorHAnsi" w:hAnsiTheme="majorHAnsi" w:cstheme="majorHAnsi"/>
+          <w:color w:val="auto"/>
+          <w:sz w:val="22"/>
+          <w:szCs w:val="22"/>
+        </w:rPr>
+        <w:t>c</w:t>
+      </w:r>
+      <w:r>
+        <w:rPr>
+          <w:rFonts w:asciiTheme="majorHAnsi" w:hAnsiTheme="majorHAnsi" w:cstheme="majorHAnsi"/>
+          <w:color w:val="auto"/>
+          <w:sz w:val="22"/>
+          <w:szCs w:val="22"/>
+        </w:rPr>
+        <w:t xml:space="preserve"> Impact</w:t>
       </w:r>
     </w:p>
     <w:p>
@@ -891,12 +658,12 @@
           <w:sz w:val="22"/>
           <w:szCs w:val="22"/>
         </w:rPr>
-        <w:t>Python</w:t>
-      </w:r>
-      <w:r>
-        <w:rPr>
-          <w:rFonts w:asciiTheme="majorHAnsi" w:hAnsiTheme="majorHAnsi" w:cstheme="majorHAnsi"/>
-          <w:bCs/>
+        <w:t>Machine Learning</w:t>
+      </w:r>
+      <w:r>
+        <w:rPr>
+          <w:rFonts w:asciiTheme="majorHAnsi" w:hAnsiTheme="majorHAnsi" w:cstheme="majorHAnsi"/>
+          <w:b/>
           <w:iCs/>
           <w:color w:val="auto"/>
           <w:sz w:val="22"/>
@@ -937,29 +704,7 @@
           <w:sz w:val="22"/>
           <w:szCs w:val="22"/>
         </w:rPr>
-        <w:t>, TensorFlow, scikit-learn</w:t>
-      </w:r>
-      <w:r>
-        <w:rPr>
-          <w:rFonts w:asciiTheme="majorHAnsi" w:hAnsiTheme="majorHAnsi" w:cstheme="majorHAnsi"/>
-          <w:bCs/>
-          <w:iCs/>
-          <w:color w:val="auto"/>
-          <w:sz w:val="22"/>
-          <w:szCs w:val="22"/>
-        </w:rPr>
-        <w:t xml:space="preserve"> (Decision Trees, Random Forests)</w:t>
-      </w:r>
-      <w:r>
-        <w:rPr>
-          <w:rFonts w:asciiTheme="majorHAnsi" w:hAnsiTheme="majorHAnsi" w:cstheme="majorHAnsi"/>
-          <w:bCs/>
-          <w:iCs/>
-          <w:color w:val="auto"/>
-          <w:sz w:val="22"/>
-          <w:szCs w:val="22"/>
-        </w:rPr>
-        <w:t>, Pandas, NumPy</w:t>
+        <w:t>, scikit-learn, TensorFlow, NLP, Autoencoders / VAEs</w:t>
       </w:r>
     </w:p>
     <w:p>
@@ -1004,18 +749,18 @@
           <w:sz w:val="22"/>
           <w:szCs w:val="22"/>
         </w:rPr>
-        <w:t>SQL</w:t>
-      </w:r>
-      <w:r>
-        <w:rPr>
-          <w:rFonts w:asciiTheme="majorHAnsi" w:hAnsiTheme="majorHAnsi" w:cstheme="majorHAnsi"/>
-          <w:bCs/>
+        <w:t>Generative AI</w:t>
+      </w:r>
+      <w:r>
+        <w:rPr>
+          <w:rFonts w:asciiTheme="majorHAnsi" w:hAnsiTheme="majorHAnsi" w:cstheme="majorHAnsi"/>
+          <w:b/>
           <w:iCs/>
           <w:color w:val="auto"/>
           <w:sz w:val="22"/>
           <w:szCs w:val="22"/>
         </w:rPr>
-        <w:t xml:space="preserve"> - </w:t>
+        <w:t xml:space="preserve"> </w:t>
       </w:r>
       <w:r>
         <w:rPr>
@@ -1026,7 +771,7 @@
           <w:sz w:val="22"/>
           <w:szCs w:val="22"/>
         </w:rPr>
-        <w:t>PostgreSQL, MSSQL,</w:t>
+        <w:t xml:space="preserve">- </w:t>
       </w:r>
       <w:r>
         <w:rPr>
@@ -1037,8 +782,9 @@
           <w:sz w:val="22"/>
           <w:szCs w:val="22"/>
         </w:rPr>
-        <w:t xml:space="preserve"> SQLite</w:t>
-      </w:r>
+        <w:t xml:space="preserve">LLMs, RAG, </w:t>
+      </w:r>
+      <w:proofErr w:type="spellStart"/>
       <w:r>
         <w:rPr>
           <w:rFonts w:asciiTheme="majorHAnsi" w:hAnsiTheme="majorHAnsi" w:cstheme="majorHAnsi"/>
@@ -1048,8 +794,9 @@
           <w:sz w:val="22"/>
           <w:szCs w:val="22"/>
         </w:rPr>
-        <w:t>;</w:t>
-      </w:r>
+        <w:t>LoRA</w:t>
+      </w:r>
+      <w:proofErr w:type="spellEnd"/>
       <w:r>
         <w:rPr>
           <w:rFonts w:asciiTheme="majorHAnsi" w:hAnsiTheme="majorHAnsi" w:cstheme="majorHAnsi"/>
@@ -1059,73 +806,7 @@
           <w:sz w:val="22"/>
           <w:szCs w:val="22"/>
         </w:rPr>
-        <w:t xml:space="preserve"> </w:t>
-      </w:r>
-      <w:r>
-        <w:rPr>
-          <w:rFonts w:asciiTheme="majorHAnsi" w:hAnsiTheme="majorHAnsi" w:cstheme="majorHAnsi"/>
-          <w:bCs/>
-          <w:iCs/>
-          <w:color w:val="auto"/>
-          <w:sz w:val="22"/>
-          <w:szCs w:val="22"/>
-        </w:rPr>
-        <w:t>Views, Stored Procedures</w:t>
-      </w:r>
-      <w:r>
-        <w:rPr>
-          <w:rFonts w:asciiTheme="majorHAnsi" w:hAnsiTheme="majorHAnsi" w:cstheme="majorHAnsi"/>
-          <w:bCs/>
-          <w:iCs/>
-          <w:color w:val="auto"/>
-          <w:sz w:val="22"/>
-          <w:szCs w:val="22"/>
-        </w:rPr>
-        <w:t xml:space="preserve"> (SPs)</w:t>
-      </w:r>
-      <w:r>
-        <w:rPr>
-          <w:rFonts w:asciiTheme="majorHAnsi" w:hAnsiTheme="majorHAnsi" w:cstheme="majorHAnsi"/>
-          <w:bCs/>
-          <w:iCs/>
-          <w:color w:val="auto"/>
-          <w:sz w:val="22"/>
-          <w:szCs w:val="22"/>
-        </w:rPr>
-        <w:t xml:space="preserve">, </w:t>
-      </w:r>
-      <w:r>
-        <w:rPr>
-          <w:rFonts w:asciiTheme="majorHAnsi" w:hAnsiTheme="majorHAnsi" w:cstheme="majorHAnsi"/>
-          <w:bCs/>
-          <w:iCs/>
-          <w:color w:val="auto"/>
-          <w:sz w:val="22"/>
-          <w:szCs w:val="22"/>
-        </w:rPr>
-        <w:t>Common Table Expressions (</w:t>
-      </w:r>
-      <w:r>
-        <w:rPr>
-          <w:rFonts w:asciiTheme="majorHAnsi" w:hAnsiTheme="majorHAnsi" w:cstheme="majorHAnsi"/>
-          <w:bCs/>
-          <w:iCs/>
-          <w:color w:val="auto"/>
-          <w:sz w:val="22"/>
-          <w:szCs w:val="22"/>
-        </w:rPr>
-        <w:t>CTE</w:t>
-      </w:r>
-      <w:r>
-        <w:rPr>
-          <w:rFonts w:asciiTheme="majorHAnsi" w:hAnsiTheme="majorHAnsi" w:cstheme="majorHAnsi"/>
-          <w:bCs/>
-          <w:iCs/>
-          <w:color w:val="auto"/>
-          <w:sz w:val="22"/>
-          <w:szCs w:val="22"/>
-        </w:rPr>
-        <w:t>s)</w:t>
+        <w:t xml:space="preserve"> Fine-Tuning, Embeddings, Transformers</w:t>
       </w:r>
     </w:p>
     <w:p>
@@ -1565,47 +1246,7 @@
           <w:sz w:val="22"/>
           <w:szCs w:val="22"/>
         </w:rPr>
-        <w:t>Automate</w:t>
-      </w:r>
-      <w:r>
-        <w:rPr>
-          <w:rFonts w:asciiTheme="majorHAnsi" w:hAnsiTheme="majorHAnsi" w:cstheme="majorHAnsi"/>
-          <w:sz w:val="22"/>
-          <w:szCs w:val="22"/>
-        </w:rPr>
-        <w:t xml:space="preserve"> weekly reporting in Python, cutting </w:t>
-      </w:r>
-      <w:r>
-        <w:rPr>
-          <w:rFonts w:asciiTheme="majorHAnsi" w:hAnsiTheme="majorHAnsi" w:cstheme="majorHAnsi"/>
-          <w:sz w:val="22"/>
-          <w:szCs w:val="22"/>
-        </w:rPr>
-        <w:t>turnaround</w:t>
-      </w:r>
-      <w:r>
-        <w:rPr>
-          <w:rFonts w:asciiTheme="majorHAnsi" w:hAnsiTheme="majorHAnsi" w:cstheme="majorHAnsi"/>
-          <w:sz w:val="22"/>
-          <w:szCs w:val="22"/>
-        </w:rPr>
-        <w:t xml:space="preserve"> time by 99%</w:t>
-      </w:r>
-      <w:r>
-        <w:rPr>
-          <w:rFonts w:asciiTheme="majorHAnsi" w:hAnsiTheme="majorHAnsi" w:cstheme="majorHAnsi"/>
-          <w:sz w:val="22"/>
-          <w:szCs w:val="22"/>
-        </w:rPr>
-        <w:t>,</w:t>
-      </w:r>
-      <w:r>
-        <w:rPr>
-          <w:rFonts w:asciiTheme="majorHAnsi" w:hAnsiTheme="majorHAnsi" w:cstheme="majorHAnsi"/>
-          <w:sz w:val="22"/>
-          <w:szCs w:val="22"/>
-        </w:rPr>
-        <w:t xml:space="preserve"> saving 200+ hours per year.</w:t>
+        <w:t>Automated Industry Data Reports and stakeholder reporting, saving 200+ hours annually and cutting turnaround 99%.</w:t>
       </w:r>
     </w:p>
     <w:p>
@@ -1643,34 +1284,7 @@
           <w:sz w:val="22"/>
           <w:szCs w:val="22"/>
         </w:rPr>
-        <w:t>Deploy</w:t>
-      </w:r>
-      <w:r>
-        <w:rPr>
-          <w:rFonts w:asciiTheme="majorHAnsi" w:hAnsiTheme="majorHAnsi" w:cstheme="majorHAnsi"/>
-          <w:bCs/>
-          <w:sz w:val="22"/>
-          <w:szCs w:val="22"/>
-        </w:rPr>
-        <w:t xml:space="preserve"> an NLP link</w:t>
-      </w:r>
-      <w:r>
-        <w:rPr>
-          <w:rFonts w:ascii="Cambria Math" w:hAnsi="Cambria Math" w:cs="Cambria Math"/>
-          <w:bCs/>
-          <w:sz w:val="22"/>
-          <w:szCs w:val="22"/>
-        </w:rPr>
-        <w:t>‑</w:t>
-      </w:r>
-      <w:r>
-        <w:rPr>
-          <w:rFonts w:asciiTheme="majorHAnsi" w:hAnsiTheme="majorHAnsi" w:cstheme="majorHAnsi"/>
-          <w:bCs/>
-          <w:sz w:val="22"/>
-          <w:szCs w:val="22"/>
-        </w:rPr>
-        <w:t>repair model that lifted site traffic 750% and engagement 56%.</w:t>
+        <w:t>Authored semimonthly council and stakeholder updates using tourism, lodging, and web-performance data.</w:t>
       </w:r>
     </w:p>
     <w:p>
@@ -1678,7 +1292,7 @@
         <w:pStyle w:val="Default"/>
         <w:rPr>
           <w:rFonts w:asciiTheme="majorHAnsi" w:hAnsiTheme="majorHAnsi" w:cstheme="majorHAnsi"/>
-          <w:b/>
+          <w:bCs/>
           <w:sz w:val="22"/>
           <w:szCs w:val="22"/>
         </w:rPr>
@@ -1708,61 +1322,85 @@
           <w:sz w:val="22"/>
           <w:szCs w:val="22"/>
         </w:rPr>
-        <w:t>Dr</w:t>
-      </w:r>
-      <w:r>
-        <w:rPr>
-          <w:rFonts w:asciiTheme="majorHAnsi" w:hAnsiTheme="majorHAnsi" w:cstheme="majorHAnsi"/>
-          <w:bCs/>
-          <w:sz w:val="22"/>
-          <w:szCs w:val="22"/>
-        </w:rPr>
-        <w:t>ive</w:t>
-      </w:r>
-      <w:r>
-        <w:rPr>
-          <w:rFonts w:asciiTheme="majorHAnsi" w:hAnsiTheme="majorHAnsi" w:cstheme="majorHAnsi"/>
-          <w:bCs/>
-          <w:sz w:val="22"/>
-          <w:szCs w:val="22"/>
-        </w:rPr>
-        <w:t xml:space="preserve"> 565% jump in page</w:t>
-      </w:r>
-      <w:r>
-        <w:rPr>
-          <w:rFonts w:ascii="Cambria Math" w:hAnsi="Cambria Math" w:cs="Cambria Math"/>
-          <w:bCs/>
-          <w:sz w:val="22"/>
-          <w:szCs w:val="22"/>
-        </w:rPr>
-        <w:t>‑</w:t>
-      </w:r>
-      <w:r>
-        <w:rPr>
-          <w:rFonts w:asciiTheme="majorHAnsi" w:hAnsiTheme="majorHAnsi" w:cstheme="majorHAnsi"/>
-          <w:bCs/>
-          <w:sz w:val="22"/>
-          <w:szCs w:val="22"/>
-        </w:rPr>
-        <w:t>views and 12</w:t>
-      </w:r>
-      <w:r>
-        <w:rPr>
-          <w:rFonts w:asciiTheme="majorHAnsi" w:hAnsiTheme="majorHAnsi" w:cstheme="majorHAnsi"/>
-          <w:bCs/>
-          <w:sz w:val="22"/>
-          <w:szCs w:val="22"/>
-        </w:rPr>
-        <w:t>2</w:t>
-      </w:r>
-      <w:r>
-        <w:rPr>
-          <w:rFonts w:asciiTheme="majorHAnsi" w:hAnsiTheme="majorHAnsi" w:cstheme="majorHAnsi"/>
-          <w:bCs/>
-          <w:sz w:val="22"/>
-          <w:szCs w:val="22"/>
-        </w:rPr>
-        <w:t>% more sessions by embedding ML insights in campaigns.</w:t>
+        <w:t>Identified lodging cannibalization by reconciling tax records with occupancy, ADR, and RevPAR, shaping council updates</w:t>
+      </w:r>
+    </w:p>
+    <w:p>
+      <w:pPr>
+        <w:pStyle w:val="Default"/>
+        <w:rPr>
+          <w:rFonts w:asciiTheme="majorHAnsi" w:hAnsiTheme="majorHAnsi" w:cstheme="majorHAnsi"/>
+          <w:bCs/>
+          <w:sz w:val="22"/>
+          <w:szCs w:val="22"/>
+        </w:rPr>
+      </w:pPr>
+      <w:r>
+        <w:rPr>
+          <w:rFonts w:asciiTheme="majorHAnsi" w:hAnsiTheme="majorHAnsi" w:cstheme="majorHAnsi"/>
+          <w:bCs/>
+          <w:sz w:val="22"/>
+          <w:szCs w:val="22"/>
+        </w:rPr>
+        <w:t xml:space="preserve">  and strategy.</w:t>
+      </w:r>
+    </w:p>
+    <w:p>
+      <w:pPr>
+        <w:pStyle w:val="Default"/>
+        <w:rPr>
+          <w:rFonts w:asciiTheme="majorHAnsi" w:hAnsiTheme="majorHAnsi" w:cstheme="majorHAnsi"/>
+          <w:bCs/>
+          <w:sz w:val="22"/>
+          <w:szCs w:val="22"/>
+        </w:rPr>
+      </w:pPr>
+      <w:r>
+        <w:rPr>
+          <w:rFonts w:asciiTheme="majorHAnsi" w:hAnsiTheme="majorHAnsi" w:cstheme="majorHAnsi"/>
+          <w:bCs/>
+          <w:sz w:val="22"/>
+          <w:szCs w:val="22"/>
+        </w:rPr>
+        <w:t>•</w:t>
+      </w:r>
+      <w:r>
+        <w:rPr>
+          <w:rFonts w:asciiTheme="majorHAnsi" w:hAnsiTheme="majorHAnsi" w:cstheme="majorHAnsi"/>
+          <w:bCs/>
+          <w:sz w:val="22"/>
+          <w:szCs w:val="22"/>
+        </w:rPr>
+        <w:t xml:space="preserve"> </w:t>
+      </w:r>
+      <w:r>
+        <w:rPr>
+          <w:rFonts w:asciiTheme="majorHAnsi" w:hAnsiTheme="majorHAnsi" w:cstheme="majorHAnsi"/>
+          <w:bCs/>
+          <w:sz w:val="22"/>
+          <w:szCs w:val="22"/>
+        </w:rPr>
+        <w:t>Researched traveler trends and AI search behavior to guide content and GEO strategy, contributing to +9.4% organic</w:t>
+      </w:r>
+    </w:p>
+    <w:p>
+      <w:pPr>
+        <w:pStyle w:val="Default"/>
+        <w:rPr>
+          <w:rFonts w:asciiTheme="majorHAnsi" w:hAnsiTheme="majorHAnsi" w:cstheme="majorHAnsi"/>
+          <w:b/>
+          <w:sz w:val="22"/>
+          <w:szCs w:val="22"/>
+        </w:rPr>
+      </w:pPr>
+      <w:r>
+        <w:rPr>
+          <w:rFonts w:asciiTheme="majorHAnsi" w:hAnsiTheme="majorHAnsi" w:cstheme="majorHAnsi"/>
+          <w:bCs/>
+          <w:sz w:val="22"/>
+          <w:szCs w:val="22"/>
+        </w:rPr>
+        <w:t xml:space="preserve">  sessions and 10x AI referrals YoY.</w:t>
       </w:r>
     </w:p>
     <w:p>
@@ -2198,55 +1836,7 @@
           <w:sz w:val="22"/>
           <w:szCs w:val="22"/>
         </w:rPr>
-        <w:t>Re</w:t>
-      </w:r>
-      <w:r>
-        <w:rPr>
-          <w:rFonts w:ascii="Cambria Math" w:hAnsi="Cambria Math" w:cs="Cambria Math"/>
-          <w:sz w:val="22"/>
-          <w:szCs w:val="22"/>
-        </w:rPr>
-        <w:t>‑</w:t>
-      </w:r>
-      <w:r>
-        <w:rPr>
-          <w:rFonts w:asciiTheme="majorHAnsi" w:hAnsiTheme="majorHAnsi" w:cstheme="majorHAnsi"/>
-          <w:sz w:val="22"/>
-          <w:szCs w:val="22"/>
-        </w:rPr>
-        <w:t>platformed</w:t>
-      </w:r>
-      <w:r>
-        <w:rPr>
-          <w:rFonts w:asciiTheme="majorHAnsi" w:hAnsiTheme="majorHAnsi" w:cstheme="majorHAnsi"/>
-          <w:sz w:val="22"/>
-          <w:szCs w:val="22"/>
-        </w:rPr>
-        <w:t xml:space="preserve"> </w:t>
-      </w:r>
-      <w:r>
-        <w:rPr>
-          <w:rFonts w:asciiTheme="majorHAnsi" w:hAnsiTheme="majorHAnsi" w:cstheme="majorHAnsi"/>
-          <w:sz w:val="22"/>
-          <w:szCs w:val="22"/>
-        </w:rPr>
-        <w:t>R workflows to a one</w:t>
-      </w:r>
-      <w:r>
-        <w:rPr>
-          <w:rFonts w:ascii="Cambria Math" w:hAnsi="Cambria Math" w:cs="Cambria Math"/>
-          <w:sz w:val="22"/>
-          <w:szCs w:val="22"/>
-        </w:rPr>
-        <w:t>‑</w:t>
-      </w:r>
-      <w:r>
-        <w:rPr>
-          <w:rFonts w:asciiTheme="majorHAnsi" w:hAnsiTheme="majorHAnsi" w:cstheme="majorHAnsi"/>
-          <w:sz w:val="22"/>
-          <w:szCs w:val="22"/>
-        </w:rPr>
-        <w:t>click Python app, trimming processing time 95%.</w:t>
+        <w:t>Re-platformed R workflows into a one-click Python app, cutting delivery time by 95%.</w:t>
       </w:r>
     </w:p>
     <w:p>
@@ -2284,16 +1874,7 @@
           <w:sz w:val="22"/>
           <w:szCs w:val="22"/>
         </w:rPr>
-        <w:t>Built</w:t>
-      </w:r>
-      <w:r>
-        <w:rPr>
-          <w:rFonts w:asciiTheme="majorHAnsi" w:hAnsiTheme="majorHAnsi" w:cstheme="majorHAnsi"/>
-          <w:bCs/>
-          <w:sz w:val="22"/>
-          <w:szCs w:val="22"/>
-        </w:rPr>
-        <w:t xml:space="preserve"> decision-tree models that expanded serial-number tracking by over 10x while flagging anomalies with 98% precision.</w:t>
+        <w:t>Built decision-tree models that expanded serial-number tracking by over 10x while flagging anomalies with 98% precision.</w:t>
       </w:r>
     </w:p>
     <w:p>
@@ -2331,99 +1912,7 @@
           <w:sz w:val="22"/>
           <w:szCs w:val="22"/>
         </w:rPr>
-        <w:t>Developed</w:t>
-      </w:r>
-      <w:r>
-        <w:rPr>
-          <w:rFonts w:asciiTheme="majorHAnsi" w:hAnsiTheme="majorHAnsi" w:cstheme="majorHAnsi"/>
-          <w:bCs/>
-          <w:sz w:val="22"/>
-          <w:szCs w:val="22"/>
-        </w:rPr>
-        <w:t xml:space="preserve"> a</w:t>
-      </w:r>
-      <w:r>
-        <w:rPr>
-          <w:rFonts w:asciiTheme="majorHAnsi" w:hAnsiTheme="majorHAnsi" w:cstheme="majorHAnsi"/>
-          <w:bCs/>
-          <w:sz w:val="22"/>
-          <w:szCs w:val="22"/>
-        </w:rPr>
-        <w:t>n</w:t>
-      </w:r>
-      <w:r>
-        <w:rPr>
-          <w:rFonts w:asciiTheme="majorHAnsi" w:hAnsiTheme="majorHAnsi" w:cstheme="majorHAnsi"/>
-          <w:bCs/>
-          <w:sz w:val="22"/>
-          <w:szCs w:val="22"/>
-        </w:rPr>
-        <w:t xml:space="preserve"> autoencoder model </w:t>
-      </w:r>
-      <w:r>
-        <w:rPr>
-          <w:rFonts w:asciiTheme="majorHAnsi" w:hAnsiTheme="majorHAnsi" w:cstheme="majorHAnsi"/>
-          <w:bCs/>
-          <w:sz w:val="22"/>
-          <w:szCs w:val="22"/>
-        </w:rPr>
-        <w:t>using</w:t>
-      </w:r>
-      <w:r>
-        <w:rPr>
-          <w:rFonts w:asciiTheme="majorHAnsi" w:hAnsiTheme="majorHAnsi" w:cstheme="majorHAnsi"/>
-          <w:bCs/>
-          <w:sz w:val="22"/>
-          <w:szCs w:val="22"/>
-        </w:rPr>
-        <w:t xml:space="preserve"> </w:t>
-      </w:r>
-      <w:proofErr w:type="spellStart"/>
-      <w:r>
-        <w:rPr>
-          <w:rFonts w:asciiTheme="majorHAnsi" w:hAnsiTheme="majorHAnsi" w:cstheme="majorHAnsi"/>
-          <w:bCs/>
-          <w:sz w:val="22"/>
-          <w:szCs w:val="22"/>
-        </w:rPr>
-        <w:t>PyTorch</w:t>
-      </w:r>
-      <w:proofErr w:type="spellEnd"/>
-      <w:r>
-        <w:rPr>
-          <w:rFonts w:asciiTheme="majorHAnsi" w:hAnsiTheme="majorHAnsi" w:cstheme="majorHAnsi"/>
-          <w:bCs/>
-          <w:sz w:val="22"/>
-          <w:szCs w:val="22"/>
-        </w:rPr>
-        <w:t xml:space="preserve">, </w:t>
-      </w:r>
-      <w:r>
-        <w:rPr>
-          <w:rFonts w:asciiTheme="majorHAnsi" w:hAnsiTheme="majorHAnsi" w:cstheme="majorHAnsi"/>
-          <w:bCs/>
-          <w:sz w:val="22"/>
-          <w:szCs w:val="22"/>
-        </w:rPr>
-        <w:t>improving</w:t>
-      </w:r>
-      <w:r>
-        <w:rPr>
-          <w:rFonts w:asciiTheme="majorHAnsi" w:hAnsiTheme="majorHAnsi" w:cstheme="majorHAnsi"/>
-          <w:bCs/>
-          <w:sz w:val="22"/>
-          <w:szCs w:val="22"/>
-        </w:rPr>
-        <w:t xml:space="preserve"> data quality through</w:t>
-      </w:r>
-      <w:r>
-        <w:rPr>
-          <w:rFonts w:asciiTheme="majorHAnsi" w:hAnsiTheme="majorHAnsi" w:cstheme="majorHAnsi"/>
-          <w:bCs/>
-          <w:sz w:val="22"/>
-          <w:szCs w:val="22"/>
-        </w:rPr>
-        <w:t xml:space="preserve"> error detection.</w:t>
+        <w:t>Deployed an autoencoder model that lifted overall data quality for downstream analytics.</w:t>
       </w:r>
     </w:p>
     <w:p>
@@ -2818,15 +2307,7 @@
           <w:sz w:val="22"/>
           <w:szCs w:val="22"/>
         </w:rPr>
-        <w:t>Designed</w:t>
-      </w:r>
-      <w:r>
-        <w:rPr>
-          <w:rFonts w:asciiTheme="majorHAnsi" w:hAnsiTheme="majorHAnsi" w:cstheme="majorHAnsi"/>
-          <w:sz w:val="22"/>
-          <w:szCs w:val="22"/>
-        </w:rPr>
-        <w:t xml:space="preserve"> enterprise dashboards adopted company-wide, surfacing trends that raised theft reports 57.6%.</w:t>
+        <w:t>Designed dashboards that boosted theft reporting by 57.6% and increased prevention 180%.</w:t>
       </w:r>
     </w:p>
     <w:p>
@@ -2864,88 +2345,7 @@
           <w:sz w:val="22"/>
           <w:szCs w:val="22"/>
         </w:rPr>
-        <w:t>Analytics</w:t>
-      </w:r>
-      <w:r>
-        <w:rPr>
-          <w:rFonts w:ascii="Cambria Math" w:hAnsi="Cambria Math" w:cs="Cambria Math"/>
-          <w:bCs/>
-          <w:sz w:val="22"/>
-          <w:szCs w:val="22"/>
-        </w:rPr>
-        <w:t>‑</w:t>
-      </w:r>
-      <w:r>
-        <w:rPr>
-          <w:rFonts w:asciiTheme="majorHAnsi" w:hAnsiTheme="majorHAnsi" w:cstheme="majorHAnsi"/>
-          <w:bCs/>
-          <w:sz w:val="22"/>
-          <w:szCs w:val="22"/>
-        </w:rPr>
-        <w:t>driven initiatives</w:t>
-      </w:r>
-      <w:r>
-        <w:rPr>
-          <w:rFonts w:asciiTheme="majorHAnsi" w:hAnsiTheme="majorHAnsi" w:cstheme="majorHAnsi"/>
-          <w:bCs/>
-          <w:sz w:val="22"/>
-          <w:szCs w:val="22"/>
-        </w:rPr>
-        <w:t xml:space="preserve"> i</w:t>
-      </w:r>
-      <w:r>
-        <w:rPr>
-          <w:rFonts w:asciiTheme="majorHAnsi" w:hAnsiTheme="majorHAnsi" w:cstheme="majorHAnsi"/>
-          <w:bCs/>
-          <w:sz w:val="22"/>
-          <w:szCs w:val="22"/>
-        </w:rPr>
-        <w:t>ncreased</w:t>
-      </w:r>
-      <w:r>
-        <w:rPr>
-          <w:rFonts w:asciiTheme="majorHAnsi" w:hAnsiTheme="majorHAnsi" w:cstheme="majorHAnsi"/>
-          <w:bCs/>
-          <w:sz w:val="22"/>
-          <w:szCs w:val="22"/>
-        </w:rPr>
-        <w:t xml:space="preserve"> </w:t>
-      </w:r>
-      <w:r>
-        <w:rPr>
-          <w:rFonts w:asciiTheme="majorHAnsi" w:hAnsiTheme="majorHAnsi" w:cstheme="majorHAnsi"/>
-          <w:bCs/>
-          <w:sz w:val="22"/>
-          <w:szCs w:val="22"/>
-        </w:rPr>
-        <w:t>theft prevention by 180%</w:t>
-      </w:r>
-      <w:r>
-        <w:rPr>
-          <w:rFonts w:asciiTheme="majorHAnsi" w:hAnsiTheme="majorHAnsi" w:cstheme="majorHAnsi"/>
-          <w:bCs/>
-          <w:sz w:val="22"/>
-          <w:szCs w:val="22"/>
-        </w:rPr>
-        <w:t xml:space="preserve">, and </w:t>
-      </w:r>
-      <w:r>
-        <w:rPr>
-          <w:rFonts w:asciiTheme="majorHAnsi" w:hAnsiTheme="majorHAnsi" w:cstheme="majorHAnsi"/>
-          <w:bCs/>
-          <w:sz w:val="22"/>
-          <w:szCs w:val="22"/>
-        </w:rPr>
-        <w:t>inventory loss</w:t>
-      </w:r>
-      <w:r>
-        <w:rPr>
-          <w:rFonts w:asciiTheme="majorHAnsi" w:hAnsiTheme="majorHAnsi" w:cstheme="majorHAnsi"/>
-          <w:bCs/>
-          <w:sz w:val="22"/>
-          <w:szCs w:val="22"/>
-        </w:rPr>
-        <w:t xml:space="preserve"> by 24%.</w:t>
+        <w:t>Reduced inventory loss by 24% through analytics-driven investigations and tooling.</w:t>
       </w:r>
     </w:p>
     <w:p>
@@ -2984,52 +2384,7 @@
           <w:sz w:val="22"/>
           <w:szCs w:val="22"/>
         </w:rPr>
-        <w:t>Presented</w:t>
-      </w:r>
-      <w:r>
-        <w:rPr>
-          <w:rFonts w:asciiTheme="majorHAnsi" w:hAnsiTheme="majorHAnsi" w:cstheme="majorHAnsi"/>
-          <w:bCs/>
-          <w:sz w:val="22"/>
-          <w:szCs w:val="22"/>
-        </w:rPr>
-        <w:t xml:space="preserve"> technical information to </w:t>
-      </w:r>
-      <w:r>
-        <w:rPr>
-          <w:rFonts w:asciiTheme="majorHAnsi" w:hAnsiTheme="majorHAnsi" w:cstheme="majorHAnsi"/>
-          <w:bCs/>
-          <w:sz w:val="22"/>
-          <w:szCs w:val="22"/>
-        </w:rPr>
-        <w:t>non-technical</w:t>
-      </w:r>
-      <w:r>
-        <w:rPr>
-          <w:rFonts w:asciiTheme="majorHAnsi" w:hAnsiTheme="majorHAnsi" w:cstheme="majorHAnsi"/>
-          <w:bCs/>
-          <w:sz w:val="22"/>
-          <w:szCs w:val="22"/>
-        </w:rPr>
-        <w:t xml:space="preserve"> audience</w:t>
-      </w:r>
-      <w:r>
-        <w:rPr>
-          <w:rFonts w:asciiTheme="majorHAnsi" w:hAnsiTheme="majorHAnsi" w:cstheme="majorHAnsi"/>
-          <w:bCs/>
-          <w:sz w:val="22"/>
-          <w:szCs w:val="22"/>
-        </w:rPr>
-        <w:t>s, translating analytics into operational action</w:t>
-      </w:r>
-      <w:r>
-        <w:rPr>
-          <w:rFonts w:asciiTheme="majorHAnsi" w:hAnsiTheme="majorHAnsi" w:cstheme="majorHAnsi"/>
-          <w:bCs/>
-          <w:sz w:val="22"/>
-          <w:szCs w:val="22"/>
-        </w:rPr>
-        <w:t>.</w:t>
+        <w:t>Presented actionable insights to non-technical stakeholders across multiple teams.</w:t>
       </w:r>
     </w:p>
     <w:p>
@@ -3761,29 +3116,7 @@
             <w:sz w:val="22"/>
             <w:szCs w:val="22"/>
           </w:rPr>
-          <w:t>Sheet Music Watermark Remov</w:t>
-        </w:r>
-        <w:r>
-          <w:rPr>
-            <w:rStyle w:val="Hyperlink"/>
-            <w:rFonts w:asciiTheme="majorHAnsi" w:hAnsiTheme="majorHAnsi" w:cstheme="majorHAnsi"/>
-            <w:b/>
-            <w:bCs/>
-            <w:sz w:val="22"/>
-            <w:szCs w:val="22"/>
-          </w:rPr>
-          <w:t>a</w:t>
-        </w:r>
-        <w:r>
-          <w:rPr>
-            <w:rStyle w:val="Hyperlink"/>
-            <w:rFonts w:asciiTheme="majorHAnsi" w:hAnsiTheme="majorHAnsi" w:cstheme="majorHAnsi"/>
-            <w:b/>
-            <w:bCs/>
-            <w:sz w:val="22"/>
-            <w:szCs w:val="22"/>
-          </w:rPr>
-          <w:t>l</w:t>
+          <w:t>Sheet Music Watermark Removal</w:t>
         </w:r>
       </w:hyperlink>
       <w:r>
@@ -3881,29 +3214,7 @@
             <w:sz w:val="22"/>
             <w:szCs w:val="22"/>
           </w:rPr>
-          <w:t>Synthetic Digit Genera</w:t>
-        </w:r>
-        <w:r>
-          <w:rPr>
-            <w:rStyle w:val="Hyperlink"/>
-            <w:rFonts w:asciiTheme="majorHAnsi" w:hAnsiTheme="majorHAnsi" w:cstheme="majorHAnsi"/>
-            <w:b/>
-            <w:bCs/>
-            <w:sz w:val="22"/>
-            <w:szCs w:val="22"/>
-          </w:rPr>
-          <w:t>t</w:t>
-        </w:r>
-        <w:r>
-          <w:rPr>
-            <w:rStyle w:val="Hyperlink"/>
-            <w:rFonts w:asciiTheme="majorHAnsi" w:hAnsiTheme="majorHAnsi" w:cstheme="majorHAnsi"/>
-            <w:b/>
-            <w:bCs/>
-            <w:sz w:val="22"/>
-            <w:szCs w:val="22"/>
-          </w:rPr>
-          <w:t>or</w:t>
+          <w:t>Synthetic Digit Generator</w:t>
         </w:r>
       </w:hyperlink>
       <w:r>
@@ -4004,29 +3315,7 @@
             <w:sz w:val="22"/>
             <w:szCs w:val="22"/>
           </w:rPr>
-          <w:t xml:space="preserve"> Sol</w:t>
-        </w:r>
-        <w:r>
-          <w:rPr>
-            <w:rStyle w:val="Hyperlink"/>
-            <w:rFonts w:asciiTheme="majorHAnsi" w:hAnsiTheme="majorHAnsi" w:cstheme="majorHAnsi"/>
-            <w:b/>
-            <w:bCs/>
-            <w:sz w:val="22"/>
-            <w:szCs w:val="22"/>
-          </w:rPr>
-          <w:t>v</w:t>
-        </w:r>
-        <w:r>
-          <w:rPr>
-            <w:rStyle w:val="Hyperlink"/>
-            <w:rFonts w:asciiTheme="majorHAnsi" w:hAnsiTheme="majorHAnsi" w:cstheme="majorHAnsi"/>
-            <w:b/>
-            <w:bCs/>
-            <w:sz w:val="22"/>
-            <w:szCs w:val="22"/>
-          </w:rPr>
-          <w:t>er</w:t>
+          <w:t xml:space="preserve"> Solver</w:t>
         </w:r>
       </w:hyperlink>
       <w:r>
@@ -4170,29 +3459,7 @@
             <w:sz w:val="22"/>
             <w:szCs w:val="22"/>
           </w:rPr>
-          <w:t xml:space="preserve"> + RA</w:t>
-        </w:r>
-        <w:r>
-          <w:rPr>
-            <w:rStyle w:val="Hyperlink"/>
-            <w:rFonts w:asciiTheme="majorHAnsi" w:hAnsiTheme="majorHAnsi" w:cstheme="majorHAnsi"/>
-            <w:b/>
-            <w:bCs/>
-            <w:sz w:val="22"/>
-            <w:szCs w:val="22"/>
-          </w:rPr>
-          <w:t>G</w:t>
-        </w:r>
-        <w:r>
-          <w:rPr>
-            <w:rStyle w:val="Hyperlink"/>
-            <w:rFonts w:asciiTheme="majorHAnsi" w:hAnsiTheme="majorHAnsi" w:cstheme="majorHAnsi"/>
-            <w:b/>
-            <w:bCs/>
-            <w:sz w:val="22"/>
-            <w:szCs w:val="22"/>
-          </w:rPr>
-          <w:t>)</w:t>
+          <w:t xml:space="preserve"> + RAG)</w:t>
         </w:r>
       </w:hyperlink>
       <w:r>

</xml_diff>